<commit_message>
fix table headers 2020→2022 in CĐ15/17/18
</commit_message>
<xml_diff>
--- a/CĐ18_7.4 Cai thien kiem ke linh vuc IPPU.docx
+++ b/CĐ18_7.4 Cai thien kiem ke linh vuc IPPU.docx
@@ -5842,7 +5842,7 @@
                 <w:color w:val="000000"/>
                 <w:rtl w:val="0"/>
               </w:rPr>
-              <w:t xml:space="preserve">2020</w:t>
+              <w:t>2022</w:t>
             </w:r>
           </w:p>
         </w:tc>
@@ -7143,7 +7143,7 @@
                 <w:b w:val="1"/>
                 <w:rtl w:val="0"/>
               </w:rPr>
-              <w:t xml:space="preserve">2020</w:t>
+              <w:t>2022</w:t>
             </w:r>
           </w:p>
         </w:tc>
@@ -8326,7 +8326,7 @@
                 <w:b w:val="1"/>
                 <w:rtl w:val="0"/>
               </w:rPr>
-              <w:t xml:space="preserve">2020</w:t>
+              <w:t>2022</w:t>
             </w:r>
           </w:p>
         </w:tc>
@@ -9159,7 +9159,7 @@
                 <w:b w:val="1"/>
                 <w:rtl w:val="0"/>
               </w:rPr>
-              <w:t xml:space="preserve">Sản lượng 2020</w:t>
+              <w:t>Sản lượng 2022</w:t>
             </w:r>
           </w:p>
         </w:tc>
@@ -9412,7 +9412,7 @@
                 <w:b w:val="1"/>
                 <w:rtl w:val="0"/>
               </w:rPr>
-              <w:t xml:space="preserve">Sản lượng 2020</w:t>
+              <w:t>Sản lượng 2022</w:t>
             </w:r>
           </w:p>
         </w:tc>
@@ -10340,7 +10340,7 @@
               <w:rPr>
                 <w:rtl w:val="0"/>
               </w:rPr>
-              <w:t xml:space="preserve">2020</w:t>
+              <w:t>2022</w:t>
             </w:r>
           </w:p>
         </w:tc>
@@ -13043,7 +13043,7 @@
                 <w:szCs w:val="26"/>
                 <w:rtl w:val="0"/>
               </w:rPr>
-              <w:t xml:space="preserve">2020</w:t>
+              <w:t>2022</w:t>
             </w:r>
           </w:p>
         </w:tc>
@@ -14875,7 +14875,7 @@
                 <w:szCs w:val="26"/>
                 <w:rtl w:val="0"/>
               </w:rPr>
-              <w:t xml:space="preserve">2020</w:t>
+              <w:t>2022</w:t>
             </w:r>
           </w:p>
         </w:tc>
@@ -15227,7 +15227,7 @@
                 <w:szCs w:val="26"/>
                 <w:rtl w:val="0"/>
               </w:rPr>
-              <w:t xml:space="preserve">2020</w:t>
+              <w:t>2022</w:t>
             </w:r>
           </w:p>
         </w:tc>
@@ -17969,7 +17969,7 @@
                 <w:color w:val="000000"/>
                 <w:rtl w:val="0"/>
               </w:rPr>
-              <w:t xml:space="preserve">2020</w:t>
+              <w:t>2022</w:t>
             </w:r>
           </w:p>
         </w:tc>
@@ -19784,7 +19784,7 @@
                 <w:color w:val="000000"/>
                 <w:rtl w:val="0"/>
               </w:rPr>
-              <w:t xml:space="preserve">Năm 2020</w:t>
+              <w:t>Năm 2022</w:t>
             </w:r>
           </w:p>
         </w:tc>
@@ -20347,7 +20347,7 @@
                 <w:b w:val="1"/>
                 <w:rtl w:val="0"/>
               </w:rPr>
-              <w:t xml:space="preserve">2020</w:t>
+              <w:t>2022</w:t>
             </w:r>
           </w:p>
         </w:tc>
@@ -22029,7 +22029,7 @@
                 <w:color w:val="000000"/>
                 <w:rtl w:val="0"/>
               </w:rPr>
-              <w:t xml:space="preserve">2020</w:t>
+              <w:t>2022</w:t>
             </w:r>
           </w:p>
         </w:tc>
@@ -24585,7 +24585,7 @@
                 <w:szCs w:val="24"/>
                 <w:rtl w:val="0"/>
               </w:rPr>
-              <w:t xml:space="preserve">2020 (CO</w:t>
+              <w:t>2022 (CO</w:t>
             </w:r>
             <w:r>
               <w:rPr>
@@ -26770,7 +26770,7 @@
                 <w:color w:val="000000"/>
                 <w:rtl w:val="0"/>
               </w:rPr>
-              <w:t xml:space="preserve">2020</w:t>
+              <w:t>2022</w:t>
             </w:r>
           </w:p>
         </w:tc>
@@ -27104,7 +27104,7 @@
                 <w:color w:val="000000"/>
                 <w:rtl w:val="0"/>
               </w:rPr>
-              <w:t xml:space="preserve">2020</w:t>
+              <w:t>2022</w:t>
             </w:r>
           </w:p>
         </w:tc>
@@ -27654,7 +27654,7 @@
                 <w:color w:val="000000"/>
                 <w:rtl w:val="0"/>
               </w:rPr>
-              <w:t xml:space="preserve">2020</w:t>
+              <w:t>2022</w:t>
             </w:r>
           </w:p>
         </w:tc>
@@ -27950,7 +27950,7 @@
                 <w:color w:val="000000"/>
                 <w:rtl w:val="0"/>
               </w:rPr>
-              <w:t xml:space="preserve">2020</w:t>
+              <w:t>2022</w:t>
             </w:r>
           </w:p>
         </w:tc>
@@ -28289,7 +28289,7 @@
                 <w:color w:val="000000"/>
                 <w:rtl w:val="0"/>
               </w:rPr>
-              <w:t xml:space="preserve">2020 (Nghìn tấn)</w:t>
+              <w:t>2022 (Nghìn tấn)</w:t>
             </w:r>
           </w:p>
         </w:tc>

</xml_diff>